<commit_message>
Deliver editable PPTX for advanced figures
</commit_message>
<xml_diff>
--- a/Cell_CNS_Figure 使用教程 最新版.docx
+++ b/Cell_CNS_Figure 使用教程 最新版.docx
@@ -117,7 +117,7 @@
           <w:color w:val="000000"/>
           <w:sz w:val="21"/>
         </w:rPr>
-        <w:t>只需要准备两样东西：文章摘要或核心研究文字，以及可用的小描 API Key。</w:t>
+        <w:t>只需要准备两样东西：文章摘要或核心研究文字，以及可用的小描 API Key 或服务端签发的邀请码。</w:t>
       </w:r>
     </w:p>
     <w:p>
@@ -131,7 +131,7 @@
           <w:color w:val="000000"/>
           <w:sz w:val="21"/>
         </w:rPr>
-        <w:t>第一次使用时，可直接在聊天中粘贴 API Key，或按提示填写配置文件。系统会自动查询余额，聊天中不会显示完整密钥。</w:t>
+        <w:t>第一次使用时，可直接在聊天中粘贴 API Key 或邀请码，或按提示填写配置文件。系统会自动查询余额，聊天中不会显示完整凭据。</w:t>
       </w:r>
     </w:p>
     <w:p>
@@ -609,7 +609,7 @@
                 <w:color w:val="000000"/>
                 <w:sz w:val="20"/>
               </w:rPr>
-              <w:t>图 A 每 3 分钟检查一次，图 B 每 10 分钟检查一次。图片返回后会自动发到当前聊天。</w:t>
+              <w:t>图 A 每 3 分钟检查一次；图 B 每 10 分钟检查一次，并返回 PNG 和可编辑 PPTX。</w:t>
             </w:r>
           </w:p>
         </w:tc>
@@ -971,7 +971,7 @@
           <w:color w:val="000000"/>
           <w:sz w:val="21"/>
         </w:rPr>
-        <w:t>每个阶段开始前都会显示实时余额并单独确认。提交成功后开始设计，额度不退；下载结果不会再次扣费。</w:t>
+        <w:t>每个阶段开始前都会显示实时余额并单独确认。提交成功后开始设计，额度不退；下载结果不会再次扣费。高级图 B 完成后会提供 PNG 和可编辑 PPTX。</w:t>
       </w:r>
     </w:p>
     <w:p>

</xml_diff>